<commit_message>
Lead the October résumé with AI-built projects
The summary now opens with directing AI coding agents and proving the
work with tests. A new "Selected AI-Built Projects" section comes before
work history: Leonard Sibelius (68,000 lines of C++, approved for Steam),
LampForge, and scan-ingest. Skills list AI tools first. Work history,
education and clearance are unchanged. File names are kept so the site's
three résumé links and any shared URLs still work.

Co-Authored-By: Claude Opus 5.5 <noreply@anthropic.com>
</commit_message>
<xml_diff>
--- a/walt-parkman-resume-10-2026.docx
+++ b/walt-parkman-resume-10-2026.docx
@@ -9,7 +9,7 @@
           <w:color w:val="16334B"/>
           <w:sz w:val="44"/>
         </w:rPr>
-        <w:t>Walt Parkman</w:t>
+        <w:t xml:space="preserve">Walt Parkman</w:t>
       </w:r>
     </w:p>
     <w:p>
@@ -17,7 +17,7 @@
         <w:rPr>
           <w:b/>
         </w:rPr>
-        <w:t>Senior Software Engineer | AI-Assisted Development | Remote</w:t>
+        <w:t xml:space="preserve">Senior Software Engineer | Production Software Built with AI Coding Agents | Remote or Reno Area</w:t>
       </w:r>
     </w:p>
     <w:p>
@@ -25,7 +25,7 @@
         <w:rPr>
           <w:sz w:val="18"/>
         </w:rPr>
-        <w:t>Fernley, Nevada | (619) 621-9555 | wparkman@protonmail.com</w:t>
+        <w:t xml:space="preserve">Fernley, Nevada | (619) 621-9555 | wparkman@protonmail.com</w:t>
       </w:r>
     </w:p>
     <w:p>
@@ -33,7 +33,7 @@
         <w:rPr>
           <w:sz w:val="18"/>
         </w:rPr>
-        <w:t>leonardsibelius.com | github.com/LeonardSibelius</w:t>
+        <w:t xml:space="preserve">leonardsibelius.com | github.com/LeonardSibelius</w:t>
       </w:r>
     </w:p>
     <w:p>
@@ -46,12 +46,12 @@
           <w:b/>
           <w:color w:val="16334B"/>
         </w:rPr>
-        <w:t>SUMMARY</w:t>
+        <w:t xml:space="preserve">SUMMARY</w:t>
       </w:r>
     </w:p>
     <w:p>
       <w:r>
-        <w:t>Software engineer with three decades of enterprise development experience across government, defense, and regulated gaming. Builds and maintains Java applications, SQL data pipelines, and production systems. Uses Claude Opus 5.5 in Claude Code for implementation, debugging, and test development, with engineering judgment and review. Seeking remote software work with a team that welcomes AI-assisted development.</w:t>
+        <w:t xml:space="preserve">Senior software engineer who directs AI coding agents to build production software, and proves it works with automated tests before it ships. In 2026, used AI coding agents (currently Claude Opus 5.5 in Claude Code) to ship a 68,000-line Unreal Engine 5.7 game approved for Steam, a C#/.NET data pipeline, and a Python geometry toolkit, each gated by its own test suite. Backed by three decades of enterprise Java and SQL across defense, government, and regulated casino gaming. Seeking remote or Reno-area work with a team that wants AI-assisted development done with discipline.</w:t>
       </w:r>
     </w:p>
     <w:p>
@@ -64,12 +64,183 @@
           <w:b/>
           <w:color w:val="16334B"/>
         </w:rPr>
-        <w:t>CORE SKILLS</w:t>
+        <w:t xml:space="preserve">SELECTED AI-BUILT PROJECTS</w:t>
+      </w:r>
+    </w:p>
+    <w:p>
+      <w:pPr>
+        <w:keepNext/>
+        <w:spacing w:before="120"/>
+      </w:pPr>
+      <w:r>
+        <w:rPr>
+          <w:b/>
+        </w:rPr>
+        <w:t xml:space="preserve">Leonard Sibelius: The Engineer Who Built Himself | May – September 2026</w:t>
+      </w:r>
+    </w:p>
+    <w:p>
+      <w:pPr>
+        <w:keepNext/>
+      </w:pPr>
+      <w:r>
+        <w:rPr>
+          <w:i/>
+          <w:sz w:val="18"/>
+        </w:rPr>
+        <w:t xml:space="preserve">Independent developer | Unreal Engine 5.7, C++ | Free on itch.io since June 2026; approved for Steam release October 6, 2026</w:t>
+      </w:r>
+    </w:p>
+    <w:p>
+      <w:pPr>
+        <w:keepNext/>
+      </w:pPr>
+      <w:r>
+        <w:rPr>
+          <w:sz w:val="18"/>
+        </w:rPr>
+        <w:t xml:space="preserve">leonardsibelius.itch.io/leonard-sibelius | store.steampowered.com/app/5249380</w:t>
+      </w:r>
+    </w:p>
+    <w:p>
+      <w:pPr>
+        <w:ind w:left="173" w:hanging="173"/>
+      </w:pPr>
+      <w:r>
+        <w:t xml:space="preserve">• Directed AI coding agents to write about 68,000 lines of C++ across 698 commits in four months: a first-person narrative game with save and reload, pathfinding AI enemies, “merge or discard” branch states, and five playable side games.</w:t>
+      </w:r>
+    </w:p>
+    <w:p>
+      <w:pPr>
+        <w:ind w:left="173" w:hanging="173"/>
+      </w:pPr>
+      <w:r>
+        <w:t xml:space="preserve">• Gated every release on more than a dozen headless smoke-test commandlets that load the real levels and exercise gameplay systems end to end, plus hands-on walk-throughs for what tests cannot see.</w:t>
+      </w:r>
+    </w:p>
+    <w:p>
+      <w:pPr>
+        <w:ind w:left="173" w:hanging="173"/>
+      </w:pPr>
+      <w:r>
+        <w:t xml:space="preserve">• Kept game logic testable outside the engine: pinball, billiards, and bowling physics and a chess engine (86 tests, checked against standard perft move counts) run standalone in about a second; slot-machine math is validated by a million-spin par-sheet test.</w:t>
+      </w:r>
+    </w:p>
+    <w:p>
+      <w:pPr>
+        <w:ind w:left="173" w:hanging="173"/>
+      </w:pPr>
+      <w:r>
+        <w:t xml:space="preserve">• Used randomized play to find what scripted tests missed: 400 random pinball games exposed a ball trap that 10 scripted games had passed.</w:t>
+      </w:r>
+    </w:p>
+    <w:p>
+      <w:pPr>
+        <w:keepNext/>
+        <w:spacing w:before="120"/>
+      </w:pPr>
+      <w:r>
+        <w:rPr>
+          <w:b/>
+        </w:rPr>
+        <w:t xml:space="preserve">LampForge | September 2026</w:t>
+      </w:r>
+    </w:p>
+    <w:p>
+      <w:pPr>
+        <w:keepNext/>
+      </w:pPr>
+      <w:r>
+        <w:rPr>
+          <w:i/>
+          <w:sz w:val="18"/>
+        </w:rPr>
+        <w:t xml:space="preserve">Python / NumPy / Blender extension / pytest</w:t>
+      </w:r>
+    </w:p>
+    <w:p>
+      <w:pPr>
+        <w:ind w:left="173" w:hanging="173"/>
+      </w:pPr>
+      <w:r>
+        <w:t xml:space="preserve">• Built a generator that turns a 2D image into a 3D-printable lampshade: silhouette tracing, fractal surface modulation, and 3MF export for spiral-vase printing.</w:t>
+      </w:r>
+    </w:p>
+    <w:p>
+      <w:pPr>
+        <w:ind w:left="173" w:hanging="173"/>
+      </w:pPr>
+      <w:r>
+        <w:t xml:space="preserve">• Encoded the printer’s physical limits (overhang slope, one loop per layer, nozzle resolution) as validators that report which height band and which design element broke a rule; covered by 45 tests.</w:t>
+      </w:r>
+    </w:p>
+    <w:p>
+      <w:pPr>
+        <w:keepNext/>
+        <w:spacing w:before="120"/>
+      </w:pPr>
+      <w:r>
+        <w:rPr>
+          <w:b/>
+        </w:rPr>
+        <w:t xml:space="preserve">scan-ingest | August 2026</w:t>
+      </w:r>
+    </w:p>
+    <w:p>
+      <w:pPr>
+        <w:keepNext/>
+      </w:pPr>
+      <w:r>
+        <w:rPr>
+          <w:i/>
+          <w:sz w:val="18"/>
+        </w:rPr>
+        <w:t>C# / .NET 8 / PostgreSQL 17 / Npgsql / Dapper / xUnit</w:t>
+      </w:r>
+    </w:p>
+    <w:p>
+      <w:pPr>
+        <w:keepNext/>
+      </w:pPr>
+      <w:r>
+        <w:rPr>
+          <w:sz w:val="18"/>
+        </w:rPr>
+        <w:t>github.com/LeonardSibelius/scan-ingest</w:t>
+      </w:r>
+    </w:p>
+    <w:p>
+      <w:pPr>
+        <w:ind w:left="173" w:hanging="173"/>
+      </w:pPr>
+      <w:r>
+        <w:t>• Built a portfolio pipeline that ingests vulnerability-scanner findings and compares them with synthetic compliance-control assessments to identify conflicting evidence.</w:t>
+      </w:r>
+    </w:p>
+    <w:p>
+      <w:pPr>
+        <w:ind w:left="173" w:hanging="173"/>
+      </w:pPr>
+      <w:r>
+        <w:t>• Normalized JSON data into partitioned PostgreSQL tables and reconciled a POA&amp;M register that opens, closes, and reopens commitments; included deterministic ingestion keys, runnable report SQL, and 13 xUnit tests.</w:t>
+      </w:r>
+    </w:p>
+    <w:p>
+      <w:pPr>
+        <w:keepNext/>
+        <w:spacing w:before="200"/>
+      </w:pPr>
+      <w:r>
+        <w:rPr>
+          <w:b/>
+          <w:color w:val="16334B"/>
+        </w:rPr>
+        <w:t xml:space="preserve">CORE SKILLS</w:t>
       </w:r>
     </w:p>
     <w:p>
       <w:r>
-        <w:t>Java, SQL, C#, Python, C++, TypeScript, JavaScript | JDBC, J2EE, Apache Camel, REST APIs | PostgreSQL, Sybase ASE, Oracle, IBM DB2 | Git, Maven, Docker, PowerShell, JUnit, pytest, xUnit | Claude Opus 5.5 / Claude Code | Unreal Engine 5.7</w:t>
+        <w:t xml:space="preserve">AI-assisted development: Claude Opus 5.5 in Claude Code, Claude Cowork; test-gated agent workflows, headless smoke tests, randomized testing | Java, SQL, C#, C++, Python, TypeScript, JavaScript | JDBC, J2EE, Apache Camel, REST APIs | PostgreSQL, Sybase ASE, Oracle, IBM DB2 | Git, Maven, Docker, PowerShell, JUnit, pytest, xUnit | Unreal Engine 5.7, Blender, NumPy</w:t>
       </w:r>
     </w:p>
     <w:p>
@@ -223,130 +394,6 @@
       </w:pPr>
       <w:r>
         <w:t>• Developed and supported Navy EFH Family Housing Java applications and Oracle databases serving housing operations across 82 Navy bases worldwide.</w:t>
-      </w:r>
-    </w:p>
-    <w:p>
-      <w:r>
-        <w:br w:type="page"/>
-      </w:r>
-    </w:p>
-    <w:p>
-      <w:pPr>
-        <w:keepNext/>
-        <w:spacing w:before="200"/>
-      </w:pPr>
-      <w:r>
-        <w:rPr>
-          <w:b/>
-          <w:color w:val="16334B"/>
-        </w:rPr>
-        <w:t>SELECTED SOFTWARE PROJECTS</w:t>
-      </w:r>
-    </w:p>
-    <w:p>
-      <w:pPr>
-        <w:keepNext/>
-        <w:spacing w:before="120"/>
-      </w:pPr>
-      <w:r>
-        <w:rPr>
-          <w:b/>
-        </w:rPr>
-        <w:t>Leonard Sibelius: The Engineer Who Built Himself | 2026</w:t>
-      </w:r>
-    </w:p>
-    <w:p>
-      <w:r>
-        <w:rPr>
-          <w:i/>
-          <w:sz w:val="18"/>
-        </w:rPr>
-        <w:t>Independent developer | Windows game published on itch.io</w:t>
-      </w:r>
-    </w:p>
-    <w:p>
-      <w:r>
-        <w:rPr>
-          <w:sz w:val="18"/>
-        </w:rPr>
-        <w:t>leonardsibelius.itch.io/leonard-sibelius</w:t>
-      </w:r>
-    </w:p>
-    <w:p>
-      <w:pPr>
-        <w:ind w:left="173" w:hanging="173"/>
-      </w:pPr>
-      <w:r>
-        <w:t>• Built and packaged a first-person narrative game in Unreal Engine 5.7 using C++, TypeScript, PowerShell, Git, and Git LFS; first published in June 2026 and updated through September.</w:t>
-      </w:r>
-    </w:p>
-    <w:p>
-      <w:pPr>
-        <w:ind w:left="173" w:hanging="173"/>
-      </w:pPr>
-      <w:r>
-        <w:t>• Directed AI-assisted implementation of gameplay interactions, persistent progression, voiced dialogue, cinematic sequences, and licensed environment integration. Recent work includes a protein-enhancement office and progression from Transhuman City to the spaceport.</w:t>
-      </w:r>
-    </w:p>
-    <w:p>
-      <w:pPr>
-        <w:ind w:left="173" w:hanging="173"/>
-      </w:pPr>
-      <w:r>
-        <w:t>• Used custom editor commandlets and headless smoke tests to verify gameplay systems, supported by repeatable asset-import scripts and build workflows.</w:t>
-      </w:r>
-    </w:p>
-    <w:p>
-      <w:pPr>
-        <w:ind w:left="173" w:hanging="173"/>
-      </w:pPr>
-      <w:r>
-        <w:t>• Current development pairs engineering review with Claude Opus 5.5 in Claude Code; earlier development used Claude Cowork and Claude Code.</w:t>
-      </w:r>
-    </w:p>
-    <w:p>
-      <w:pPr>
-        <w:keepNext/>
-        <w:spacing w:before="120"/>
-      </w:pPr>
-      <w:r>
-        <w:rPr>
-          <w:b/>
-        </w:rPr>
-        <w:t>scan-ingest | August 2026</w:t>
-      </w:r>
-    </w:p>
-    <w:p>
-      <w:r>
-        <w:rPr>
-          <w:i/>
-          <w:sz w:val="18"/>
-        </w:rPr>
-        <w:t>C# / .NET 8 / PostgreSQL 17 / Npgsql / Dapper / xUnit</w:t>
-      </w:r>
-    </w:p>
-    <w:p>
-      <w:r>
-        <w:rPr>
-          <w:sz w:val="18"/>
-        </w:rPr>
-        <w:t>github.com/LeonardSibelius/scan-ingest</w:t>
-      </w:r>
-    </w:p>
-    <w:p>
-      <w:pPr>
-        <w:ind w:left="173" w:hanging="173"/>
-      </w:pPr>
-      <w:r>
-        <w:t>• Built a portfolio pipeline that ingests vulnerability-scanner findings and compares them with synthetic compliance-control assessments to identify conflicting evidence.</w:t>
-      </w:r>
-    </w:p>
-    <w:p>
-      <w:pPr>
-        <w:ind w:left="173" w:hanging="173"/>
-      </w:pPr>
-      <w:r>
-        <w:t>• Normalized JSON data into partitioned PostgreSQL tables and reconciled a POA&amp;M register that opens, closes, and reopens commitments; included deterministic ingestion keys, runnable report SQL, and 13 xUnit tests.</w:t>
       </w:r>
     </w:p>
     <w:p>

</xml_diff>